<commit_message>
Revamp About page; add MEL post & assets
Overhaul about.html with updated meta/summary, new dark-mode default, career highlights, professional experience timeline, part-time consulting section, redesigned values copy, styling for stats/timeline, and small text tweaks (removed emoji in headers/footers, punctuation edits, console log tweak). Remove legacy about_old.html. Add MEL assets and content: new SVG (assets/images/mel-cycle.svg) and a new blog post (blog/mel-in-conservation.html), and update blog.html to feature the MEL primer. Replace updated CV files (assets/documents/cv.docx and cv.pdf) and add a backup copy (assets/documents/cv_backup_original.docx).
</commit_message>
<xml_diff>
--- a/assets/documents/cv.docx
+++ b/assets/documents/cv.docx
@@ -6,8 +6,6 @@
       <w:pPr>
         <w:pStyle w:val="Title"/>
       </w:pPr>
-      <w:bookmarkStart w:id="0" w:name="_GoBack"/>
-      <w:bookmarkEnd w:id="0"/>
       <w:r>
         <w:t>JARIAN PERMANA</w:t>
       </w:r>
@@ -23,7 +21,7 @@
     <w:tbl>
       <w:tblPr>
         <w:tblStyle w:val="a"/>
-        <w:tblW w:w="9405" w:type="dxa"/>
+        <w:tblW w:w="9270" w:type="dxa"/>
         <w:tblInd w:w="0" w:type="dxa"/>
         <w:tblBorders>
           <w:top w:val="single" w:sz="4" w:space="0" w:color="000000"/>
@@ -38,8 +36,8 @@
       </w:tblPr>
       <w:tblGrid>
         <w:gridCol w:w="3225"/>
-        <w:gridCol w:w="3045"/>
-        <w:gridCol w:w="3135"/>
+        <w:gridCol w:w="2715"/>
+        <w:gridCol w:w="3330"/>
       </w:tblGrid>
       <w:tr>
         <w:tc>
@@ -65,14 +63,7 @@
                 <w:sz w:val="18"/>
                 <w:szCs w:val="18"/>
               </w:rPr>
-              <w:t xml:space="preserve">📱  </w:t>
-            </w:r>
-            <w:r>
-              <w:rPr>
-                <w:sz w:val="18"/>
-                <w:szCs w:val="18"/>
-              </w:rPr>
-              <w:t xml:space="preserve">  </w:t>
+              <w:t xml:space="preserve">📱    </w:t>
             </w:r>
             <w:r>
               <w:rPr>
@@ -90,7 +81,6 @@
                 <w:szCs w:val="18"/>
               </w:rPr>
             </w:pPr>
-            <w:proofErr w:type="gramStart"/>
             <w:r>
               <w:rPr>
                 <w:sz w:val="18"/>
@@ -106,12 +96,11 @@
               </w:rPr>
               <w:t>jarian.work.1@gmail.com</w:t>
             </w:r>
-            <w:proofErr w:type="gramEnd"/>
           </w:p>
         </w:tc>
         <w:tc>
           <w:tcPr>
-            <w:tcW w:w="3045" w:type="dxa"/>
+            <w:tcW w:w="2715" w:type="dxa"/>
             <w:tcBorders>
               <w:top w:val="nil"/>
               <w:left w:val="nil"/>
@@ -126,62 +115,40 @@
                 <w:szCs w:val="18"/>
               </w:rPr>
             </w:pPr>
-            <w:proofErr w:type="gramStart"/>
             <w:r>
               <w:rPr>
                 <w:sz w:val="18"/>
                 <w:szCs w:val="18"/>
               </w:rPr>
-              <w:t xml:space="preserve">🎓  </w:t>
-            </w:r>
-            <w:r>
+              <w:t xml:space="preserve">🎓  Bachelor of Forestry, </w:t>
+            </w:r>
+          </w:p>
+          <w:p>
+            <w:pPr>
               <w:rPr>
                 <w:sz w:val="18"/>
                 <w:szCs w:val="18"/>
               </w:rPr>
-              <w:t>Bachelor</w:t>
-            </w:r>
-            <w:proofErr w:type="gramEnd"/>
+            </w:pPr>
             <w:r>
               <w:rPr>
                 <w:sz w:val="18"/>
                 <w:szCs w:val="18"/>
               </w:rPr>
-              <w:t xml:space="preserve"> of Forestry, </w:t>
-            </w:r>
-          </w:p>
-          <w:p>
-            <w:pPr>
-              <w:rPr>
-                <w:sz w:val="18"/>
-                <w:szCs w:val="18"/>
-              </w:rPr>
-            </w:pPr>
-            <w:r>
-              <w:rPr>
-                <w:sz w:val="18"/>
-                <w:szCs w:val="18"/>
-              </w:rPr>
-              <w:t xml:space="preserve">        </w:t>
-            </w:r>
-            <w:r>
-              <w:rPr>
-                <w:sz w:val="18"/>
-                <w:szCs w:val="18"/>
-              </w:rPr>
-              <w:t>University of Sumatera Utara</w:t>
+              <w:t xml:space="preserve">        University of Sumatera Utara</w:t>
             </w:r>
           </w:p>
         </w:tc>
         <w:tc>
           <w:tcPr>
-            <w:tcW w:w="3135" w:type="dxa"/>
+            <w:tcW w:w="3330" w:type="dxa"/>
             <w:tcBorders>
               <w:top w:val="nil"/>
               <w:left w:val="nil"/>
               <w:bottom w:val="nil"/>
               <w:right w:val="nil"/>
             </w:tcBorders>
+            <w:vAlign w:val="center"/>
           </w:tcPr>
           <w:p>
             <w:pPr>
@@ -198,13 +165,13 @@
                 <w:szCs w:val="18"/>
               </w:rPr>
               <w:drawing>
-                <wp:anchor distT="0" distB="0" distL="114300" distR="114300" simplePos="0" relativeHeight="251658240" behindDoc="1" locked="0" layoutInCell="1" allowOverlap="1" wp14:anchorId="23CB10F5" wp14:editId="40564F9C">
+                <wp:anchor distT="0" distB="0" distL="114300" distR="114300" simplePos="0" relativeHeight="251658240" behindDoc="1" locked="0" layoutInCell="1" allowOverlap="1" wp14:anchorId="23CB10F5" wp14:editId="19DD35F7">
                   <wp:simplePos x="0" y="0"/>
                   <wp:positionH relativeFrom="column">
-                    <wp:posOffset>-635</wp:posOffset>
+                    <wp:posOffset>10795</wp:posOffset>
                   </wp:positionH>
                   <wp:positionV relativeFrom="paragraph">
-                    <wp:posOffset>3175</wp:posOffset>
+                    <wp:posOffset>7620</wp:posOffset>
                   </wp:positionV>
                   <wp:extent cx="129540" cy="144780"/>
                   <wp:effectExtent l="0" t="0" r="3810" b="7620"/>
@@ -258,21 +225,7 @@
                 <w:sz w:val="18"/>
                 <w:szCs w:val="18"/>
               </w:rPr>
-              <w:t>lin</w:t>
-            </w:r>
-            <w:r>
-              <w:rPr>
-                <w:sz w:val="18"/>
-                <w:szCs w:val="18"/>
-              </w:rPr>
-              <w:t>k</w:t>
-            </w:r>
-            <w:r>
-              <w:rPr>
-                <w:sz w:val="18"/>
-                <w:szCs w:val="18"/>
-              </w:rPr>
-              <w:t>edin.com/in/</w:t>
+              <w:t>linkedin.com/in/</w:t>
             </w:r>
             <w:proofErr w:type="spellStart"/>
             <w:r>
@@ -351,28 +304,95 @@
                 <w:sz w:val="18"/>
                 <w:szCs w:val="18"/>
               </w:rPr>
-              <w:t xml:space="preserve">    </w:t>
+              <w:t xml:space="preserve">   </w:t>
+            </w:r>
+            <w:r>
+              <w:rPr>
+                <w:noProof/>
+                <w:sz w:val="18"/>
+                <w:szCs w:val="18"/>
+              </w:rPr>
+              <w:t xml:space="preserve"> </w:t>
             </w:r>
             <w:hyperlink r:id="rId10" w:history="1">
               <w:r>
                 <w:rPr>
                   <w:rStyle w:val="Hyperlink"/>
+                  <w:sz w:val="16"/>
+                  <w:szCs w:val="16"/>
                 </w:rPr>
-                <w:t xml:space="preserve">Jarian Portfolio </w:t>
+                <w:t>Data Science Portfolio | Jarian Permana</w:t>
               </w:r>
             </w:hyperlink>
-            <w:r>
-              <w:t xml:space="preserve"> </w:t>
-            </w:r>
+          </w:p>
+        </w:tc>
+      </w:tr>
+      <w:tr>
+        <w:trPr>
+          <w:trHeight w:val="234"/>
+        </w:trPr>
+        <w:tc>
+          <w:tcPr>
+            <w:tcW w:w="3225" w:type="dxa"/>
+            <w:tcBorders>
+              <w:top w:val="nil"/>
+              <w:left w:val="nil"/>
+              <w:bottom w:val="nil"/>
+              <w:right w:val="nil"/>
+            </w:tcBorders>
+          </w:tcPr>
+          <w:p>
+            <w:pPr>
+              <w:spacing w:after="80"/>
+              <w:rPr>
+                <w:sz w:val="18"/>
+                <w:szCs w:val="18"/>
+              </w:rPr>
+            </w:pPr>
+          </w:p>
+        </w:tc>
+        <w:tc>
+          <w:tcPr>
+            <w:tcW w:w="2715" w:type="dxa"/>
+            <w:tcBorders>
+              <w:top w:val="nil"/>
+              <w:left w:val="nil"/>
+              <w:bottom w:val="nil"/>
+              <w:right w:val="nil"/>
+            </w:tcBorders>
+          </w:tcPr>
+          <w:p>
+            <w:pPr>
+              <w:rPr>
+                <w:sz w:val="18"/>
+                <w:szCs w:val="18"/>
+              </w:rPr>
+            </w:pPr>
+          </w:p>
+        </w:tc>
+        <w:tc>
+          <w:tcPr>
+            <w:tcW w:w="3330" w:type="dxa"/>
+            <w:tcBorders>
+              <w:top w:val="nil"/>
+              <w:left w:val="nil"/>
+              <w:bottom w:val="nil"/>
+              <w:right w:val="nil"/>
+            </w:tcBorders>
+            <w:vAlign w:val="center"/>
+          </w:tcPr>
+          <w:p>
+            <w:pPr>
+              <w:rPr>
+                <w:noProof/>
+                <w:sz w:val="18"/>
+                <w:szCs w:val="18"/>
+              </w:rPr>
+            </w:pPr>
           </w:p>
         </w:tc>
       </w:tr>
     </w:tbl>
-    <w:p>
-      <w:pPr>
-        <w:spacing w:before="300"/>
-      </w:pPr>
-    </w:p>
     <w:tbl>
       <w:tblPr>
         <w:tblStyle w:val="a0"/>
@@ -394,9 +414,12 @@
         <w:gridCol w:w="9110"/>
       </w:tblGrid>
       <w:tr>
+        <w:trPr>
+          <w:trHeight w:val="1665"/>
+        </w:trPr>
         <w:tc>
           <w:tcPr>
-            <w:tcW w:w="180" w:type="dxa"/>
+            <w:tcW w:w="250" w:type="dxa"/>
             <w:tcBorders>
               <w:top w:val="nil"/>
               <w:left w:val="nil"/>
@@ -409,7 +432,7 @@
         </w:tc>
         <w:tc>
           <w:tcPr>
-            <w:tcW w:w="9180" w:type="dxa"/>
+            <w:tcW w:w="9110" w:type="dxa"/>
             <w:tcBorders>
               <w:top w:val="nil"/>
               <w:left w:val="nil"/>
@@ -420,74 +443,14 @@
           </w:tcPr>
           <w:p>
             <w:pPr>
-              <w:spacing w:before="200" w:after="200"/>
-              <w:ind w:left="200"/>
+              <w:spacing w:before="200" w:after="60"/>
+              <w:ind w:left="202"/>
             </w:pPr>
             <w:r>
               <w:rPr>
                 <w:color w:val="333333"/>
               </w:rPr>
-              <w:t>Dedicated conservation professional with 1</w:t>
-            </w:r>
-            <w:r>
-              <w:rPr>
-                <w:color w:val="333333"/>
-              </w:rPr>
-              <w:t>0</w:t>
-            </w:r>
-            <w:r>
-              <w:rPr>
-                <w:color w:val="333333"/>
-              </w:rPr>
-              <w:t xml:space="preserve">+ years of </w:t>
-            </w:r>
-            <w:r>
-              <w:rPr>
-                <w:color w:val="333333"/>
-              </w:rPr>
-              <w:t xml:space="preserve">working </w:t>
-            </w:r>
-            <w:r>
-              <w:rPr>
-                <w:color w:val="333333"/>
-              </w:rPr>
-              <w:t xml:space="preserve">experience with </w:t>
-            </w:r>
-            <w:r>
-              <w:rPr>
-                <w:color w:val="333333"/>
-              </w:rPr>
-              <w:t xml:space="preserve">leading </w:t>
-            </w:r>
-            <w:r>
-              <w:rPr>
-                <w:color w:val="333333"/>
-              </w:rPr>
-              <w:t xml:space="preserve">NGOs and cross-disciplinary teams in </w:t>
-            </w:r>
-            <w:r>
-              <w:rPr>
-                <w:color w:val="333333"/>
-              </w:rPr>
-              <w:t xml:space="preserve">science and </w:t>
-            </w:r>
-            <w:r>
-              <w:rPr>
-                <w:color w:val="333333"/>
-              </w:rPr>
-              <w:t>conservation</w:t>
-            </w:r>
-            <w:r>
-              <w:rPr>
-                <w:color w:val="333333"/>
-              </w:rPr>
-              <w:t xml:space="preserve"> action</w:t>
-            </w:r>
-            <w:r>
-              <w:rPr>
-                <w:color w:val="333333"/>
-              </w:rPr>
-              <w:t>. Expertise includes orangutan habitat management, marine conservation, spatial planning, and community-based initiatives throughout Indonesia. Proven ability to deliver scientific research, engage diverse stakeholders, and implement innovative conservation technologies.</w:t>
+              <w:t>Dedicated conservation professional with 10+ years of working experience with leading NGOs and cross-disciplinary teams in science and conservation action. Expertise includes orangutan habitat management, marine conservation, spatial planning, and community-based initiatives throughout Indonesia. Proven ability to deliver scientific research, engage diverse stakeholders, and implement innovative conservation technologies.</w:t>
             </w:r>
           </w:p>
         </w:tc>
@@ -603,17 +566,7 @@
                 <w:sz w:val="20"/>
                 <w:szCs w:val="20"/>
               </w:rPr>
-              <w:t>TECHNICAL</w:t>
-            </w:r>
-            <w:r>
-              <w:rPr>
-                <w:b/>
-                <w:bCs/>
-                <w:color w:val="C9A227"/>
-                <w:sz w:val="20"/>
-                <w:szCs w:val="20"/>
-              </w:rPr>
-              <w:t xml:space="preserve"> ANALYTICAL</w:t>
+              <w:t>TECHNICAL ANALYTICAL</w:t>
             </w:r>
           </w:p>
           <w:p>
@@ -640,47 +593,7 @@
                 <w:sz w:val="20"/>
                 <w:szCs w:val="20"/>
               </w:rPr>
-              <w:t xml:space="preserve">Biodiversity and Ecology </w:t>
-            </w:r>
-            <w:r>
-              <w:rPr>
-                <w:color w:val="333333"/>
-                <w:sz w:val="20"/>
-                <w:szCs w:val="20"/>
-              </w:rPr>
-              <w:t>As</w:t>
-            </w:r>
-            <w:r>
-              <w:rPr>
-                <w:color w:val="333333"/>
-                <w:sz w:val="20"/>
-                <w:szCs w:val="20"/>
-              </w:rPr>
-              <w:t>s</w:t>
-            </w:r>
-            <w:r>
-              <w:rPr>
-                <w:color w:val="333333"/>
-                <w:sz w:val="20"/>
-                <w:szCs w:val="20"/>
-              </w:rPr>
-              <w:t>ess</w:t>
-            </w:r>
-            <w:r>
-              <w:rPr>
-                <w:color w:val="333333"/>
-                <w:sz w:val="20"/>
-                <w:szCs w:val="20"/>
-              </w:rPr>
-              <w:t>m</w:t>
-            </w:r>
-            <w:r>
-              <w:rPr>
-                <w:color w:val="333333"/>
-                <w:sz w:val="20"/>
-                <w:szCs w:val="20"/>
-              </w:rPr>
-              <w:t>ents</w:t>
+              <w:t>Biodiversity and Ecology Assessments</w:t>
             </w:r>
           </w:p>
           <w:p>
@@ -733,21 +646,7 @@
                 <w:sz w:val="20"/>
                 <w:szCs w:val="20"/>
               </w:rPr>
-              <w:t>Population Viability As</w:t>
-            </w:r>
-            <w:r>
-              <w:rPr>
-                <w:sz w:val="20"/>
-                <w:szCs w:val="20"/>
-              </w:rPr>
-              <w:t>s</w:t>
-            </w:r>
-            <w:r>
-              <w:rPr>
-                <w:sz w:val="20"/>
-                <w:szCs w:val="20"/>
-              </w:rPr>
-              <w:t>essment</w:t>
+              <w:t>Population Viability Assessment</w:t>
             </w:r>
           </w:p>
           <w:p>
@@ -829,17 +728,7 @@
                 <w:sz w:val="20"/>
                 <w:szCs w:val="20"/>
               </w:rPr>
-              <w:t>ANALYTICAL</w:t>
-            </w:r>
-            <w:r>
-              <w:rPr>
-                <w:b/>
-                <w:bCs/>
-                <w:color w:val="C9A227"/>
-                <w:sz w:val="20"/>
-                <w:szCs w:val="20"/>
-              </w:rPr>
-              <w:t xml:space="preserve"> TOOLS</w:t>
+              <w:t>ANALYTICAL TOOLS</w:t>
             </w:r>
           </w:p>
           <w:p>
@@ -1056,15 +945,7 @@
                 <w:sz w:val="20"/>
                 <w:szCs w:val="20"/>
               </w:rPr>
-              <w:t xml:space="preserve">Biodiversity and </w:t>
-            </w:r>
-            <w:r>
-              <w:rPr>
-                <w:color w:val="333333"/>
-                <w:sz w:val="20"/>
-                <w:szCs w:val="20"/>
-              </w:rPr>
-              <w:t>Ecology Management</w:t>
+              <w:t>Biodiversity and Ecology Management</w:t>
             </w:r>
           </w:p>
           <w:p>
@@ -1097,8 +978,6 @@
         </w:tc>
       </w:tr>
     </w:tbl>
-    <w:p/>
-    <w:p/>
     <w:p/>
     <w:p/>
     <w:tbl>
@@ -1152,11 +1031,6 @@
         </w:tc>
       </w:tr>
     </w:tbl>
-    <w:p>
-      <w:pPr>
-        <w:spacing w:before="300"/>
-      </w:pPr>
-    </w:p>
     <w:tbl>
       <w:tblPr>
         <w:tblStyle w:val="a4"/>
@@ -1189,6 +1063,9 @@
             </w:tcBorders>
           </w:tcPr>
           <w:p>
+            <w:pPr>
+              <w:spacing w:before="120"/>
+            </w:pPr>
             <w:r>
               <w:rPr>
                 <w:rFonts w:ascii="Georgia" w:eastAsia="Georgia" w:hAnsi="Georgia" w:cs="Georgia"/>
@@ -1208,18 +1085,8 @@
                 <w:iCs/>
                 <w:color w:val="1A7575"/>
               </w:rPr>
-              <w:t xml:space="preserve">Fauna &amp; Flora Indonesia </w:t>
-            </w:r>
-            <w:proofErr w:type="spellStart"/>
-            <w:r>
-              <w:rPr>
-                <w:i/>
-                <w:iCs/>
-                <w:color w:val="1A7575"/>
-              </w:rPr>
-              <w:t>Programme</w:t>
-            </w:r>
-            <w:proofErr w:type="spellEnd"/>
+              <w:t>Fauna &amp; Flora Indonesia Programme</w:t>
+            </w:r>
           </w:p>
         </w:tc>
         <w:tc>
@@ -1245,7 +1112,7 @@
                 <w:sz w:val="20"/>
                 <w:szCs w:val="20"/>
               </w:rPr>
-              <w:t>2022 – Present</w:t>
+              <w:t>Jul 2022 – Jun 2026</w:t>
             </w:r>
           </w:p>
         </w:tc>
@@ -1293,31 +1160,7 @@
           <w:sz w:val="20"/>
           <w:szCs w:val="20"/>
         </w:rPr>
-        <w:t xml:space="preserve">Spearheaded ecological management efforts across priority landscapes in West Kalimantan, delivering integrated terrestrial habitat conservation and seascape habitat assessments </w:t>
-      </w:r>
-      <w:r>
-        <w:rPr>
-          <w:color w:val="333333"/>
-          <w:sz w:val="20"/>
-          <w:szCs w:val="20"/>
-        </w:rPr>
-        <w:t>within key achievements:</w:t>
-      </w:r>
-      <w:r>
-        <w:rPr>
-          <w:color w:val="333333"/>
-          <w:sz w:val="20"/>
-          <w:szCs w:val="20"/>
-        </w:rPr>
-        <w:t xml:space="preserve"> </w:t>
-      </w:r>
-      <w:r>
-        <w:rPr>
-          <w:color w:val="333333"/>
-          <w:sz w:val="20"/>
-          <w:szCs w:val="20"/>
-        </w:rPr>
-        <w:t xml:space="preserve"> </w:t>
+        <w:t xml:space="preserve">Spearheaded ecological management efforts across priority landscapes in West Kalimantan, delivering integrated terrestrial habitat conservation and seascape habitat assessments within key achievements:  </w:t>
       </w:r>
     </w:p>
     <w:p>
@@ -1347,33 +1190,7 @@
           <w:sz w:val="20"/>
           <w:szCs w:val="20"/>
         </w:rPr>
-        <w:t xml:space="preserve">Pioneered Citizen Science monitoring program in </w:t>
-      </w:r>
-      <w:proofErr w:type="spellStart"/>
-      <w:r>
-        <w:rPr>
-          <w:color w:val="333333"/>
-          <w:sz w:val="20"/>
-          <w:szCs w:val="20"/>
-        </w:rPr>
-        <w:t>Karimata</w:t>
-      </w:r>
-      <w:proofErr w:type="spellEnd"/>
-      <w:r>
-        <w:rPr>
-          <w:color w:val="333333"/>
-          <w:sz w:val="20"/>
-          <w:szCs w:val="20"/>
-        </w:rPr>
-        <w:t xml:space="preserve"> Islands Nature Reserve, increasing METT scores by 12.5%</w:t>
-      </w:r>
-      <w:r>
-        <w:rPr>
-          <w:color w:val="333333"/>
-          <w:sz w:val="20"/>
-          <w:szCs w:val="20"/>
-        </w:rPr>
-        <w:t xml:space="preserve"> </w:t>
+        <w:t xml:space="preserve">Pioneered Citizen Science monitoring program in Karimata Islands Nature Reserve, increasing METT scores by 12.5% </w:t>
       </w:r>
     </w:p>
     <w:p>
@@ -1403,59 +1220,7 @@
           <w:sz w:val="20"/>
           <w:szCs w:val="20"/>
         </w:rPr>
-        <w:t xml:space="preserve">Strengthened wildlife protection and community wellbeing through multi-stakeholder collaboration adjacent to </w:t>
-      </w:r>
-      <w:proofErr w:type="spellStart"/>
-      <w:r>
-        <w:rPr>
-          <w:color w:val="333333"/>
-          <w:sz w:val="20"/>
-          <w:szCs w:val="20"/>
-        </w:rPr>
-        <w:t>Muara</w:t>
-      </w:r>
-      <w:proofErr w:type="spellEnd"/>
-      <w:r>
-        <w:rPr>
-          <w:color w:val="333333"/>
-          <w:sz w:val="20"/>
-          <w:szCs w:val="20"/>
-        </w:rPr>
-        <w:t xml:space="preserve"> </w:t>
-      </w:r>
-      <w:proofErr w:type="spellStart"/>
-      <w:r>
-        <w:rPr>
-          <w:color w:val="333333"/>
-          <w:sz w:val="20"/>
-          <w:szCs w:val="20"/>
-        </w:rPr>
-        <w:t>Kendawangan</w:t>
-      </w:r>
-      <w:proofErr w:type="spellEnd"/>
-      <w:r>
-        <w:rPr>
-          <w:color w:val="333333"/>
-          <w:sz w:val="20"/>
-          <w:szCs w:val="20"/>
-        </w:rPr>
-        <w:t xml:space="preserve"> Nature Reserve</w:t>
-      </w:r>
-      <w:r>
-        <w:rPr>
-          <w:color w:val="333333"/>
-          <w:sz w:val="20"/>
-          <w:szCs w:val="20"/>
-        </w:rPr>
-        <w:t xml:space="preserve">, increasing METT scores </w:t>
-      </w:r>
-      <w:r>
-        <w:rPr>
-          <w:color w:val="333333"/>
-          <w:sz w:val="20"/>
-          <w:szCs w:val="20"/>
-        </w:rPr>
-        <w:t xml:space="preserve">by 6% </w:t>
+        <w:t xml:space="preserve">Strengthened wildlife protection and community wellbeing through multi-stakeholder collaboration adjacent to Muara Kendawangan Nature Reserve, increasing METT scores by 6% </w:t>
       </w:r>
     </w:p>
     <w:p>
@@ -1486,61 +1251,7 @@
           <w:sz w:val="20"/>
           <w:szCs w:val="20"/>
         </w:rPr>
-        <w:t xml:space="preserve">Improved protection and sustainable use of </w:t>
-      </w:r>
-      <w:proofErr w:type="spellStart"/>
-      <w:r>
-        <w:rPr>
-          <w:color w:val="333333"/>
-          <w:sz w:val="20"/>
-          <w:szCs w:val="20"/>
-        </w:rPr>
-        <w:t>Gunung</w:t>
-      </w:r>
-      <w:proofErr w:type="spellEnd"/>
-      <w:r>
-        <w:rPr>
-          <w:color w:val="333333"/>
-          <w:sz w:val="20"/>
-          <w:szCs w:val="20"/>
-        </w:rPr>
-        <w:t xml:space="preserve"> </w:t>
-      </w:r>
-      <w:proofErr w:type="spellStart"/>
-      <w:r>
-        <w:rPr>
-          <w:color w:val="333333"/>
-          <w:sz w:val="20"/>
-          <w:szCs w:val="20"/>
-        </w:rPr>
-        <w:t>Palung</w:t>
-      </w:r>
-      <w:proofErr w:type="spellEnd"/>
-      <w:r>
-        <w:rPr>
-          <w:color w:val="333333"/>
-          <w:sz w:val="20"/>
-          <w:szCs w:val="20"/>
-        </w:rPr>
-        <w:t xml:space="preserve"> National Park and adjacent village forests by implementing collaborative patrolling, effective fire prevention, and biodiversity-friendly livelihoods. This resulted in a 55% reduction in forest crimes compared to the 2020 baseline, a 12.6% increase in the Bornean orangutan population, and </w:t>
-      </w:r>
-      <w:proofErr w:type="gramStart"/>
-      <w:r>
-        <w:rPr>
-          <w:color w:val="333333"/>
-          <w:sz w:val="20"/>
-          <w:szCs w:val="20"/>
-        </w:rPr>
-        <w:t>an</w:t>
-      </w:r>
-      <w:proofErr w:type="gramEnd"/>
-      <w:r>
-        <w:rPr>
-          <w:color w:val="333333"/>
-          <w:sz w:val="20"/>
-          <w:szCs w:val="20"/>
-        </w:rPr>
-        <w:t xml:space="preserve"> METT score of 80.49%</w:t>
+        <w:t>Improved protection and sustainable use of Gunung Palung National Park and adjacent village forests by implementing collaborative patrolling, effective fire prevention, and biodiversity-friendly livelihoods. This resulted in a 55% reduction in forest crimes compared to the 2020 baseline, a 12.6% increase in the Bornean orangutan population, and an METT score of 80.49%</w:t>
       </w:r>
     </w:p>
     <w:p>
@@ -1571,43 +1282,7 @@
           <w:sz w:val="20"/>
           <w:szCs w:val="20"/>
         </w:rPr>
-        <w:t xml:space="preserve">Successfully facilitated the establishment of fourteen Village Forests, with twelve in the </w:t>
-      </w:r>
-      <w:proofErr w:type="spellStart"/>
-      <w:r>
-        <w:rPr>
-          <w:color w:val="333333"/>
-          <w:sz w:val="20"/>
-          <w:szCs w:val="20"/>
-        </w:rPr>
-        <w:t>Schwaner</w:t>
-      </w:r>
-      <w:proofErr w:type="spellEnd"/>
-      <w:r>
-        <w:rPr>
-          <w:color w:val="333333"/>
-          <w:sz w:val="20"/>
-          <w:szCs w:val="20"/>
-        </w:rPr>
-        <w:t xml:space="preserve"> landscape and two in the </w:t>
-      </w:r>
-      <w:proofErr w:type="spellStart"/>
-      <w:r>
-        <w:rPr>
-          <w:color w:val="333333"/>
-          <w:sz w:val="20"/>
-          <w:szCs w:val="20"/>
-        </w:rPr>
-        <w:t>Karimata</w:t>
-      </w:r>
-      <w:proofErr w:type="spellEnd"/>
-      <w:r>
-        <w:rPr>
-          <w:color w:val="333333"/>
-          <w:sz w:val="20"/>
-          <w:szCs w:val="20"/>
-        </w:rPr>
-        <w:t xml:space="preserve"> landscape, all granted official management permits by the Ministry of Environment and Forestry</w:t>
+        <w:t>Successfully facilitated the establishment of fourteen Village Forests, with twelve in the Schwaner landscape and two in the Karimata landscape, all granted official management permits by the Ministry of Environment and Forestry</w:t>
       </w:r>
     </w:p>
     <w:p>
@@ -1636,26 +1311,7 @@
           <w:sz w:val="20"/>
           <w:szCs w:val="20"/>
         </w:rPr>
-        <w:lastRenderedPageBreak/>
-        <w:t>A High Value Conservation Assessment (HVC) was conducted for the Arabella-</w:t>
-      </w:r>
-      <w:proofErr w:type="spellStart"/>
-      <w:r>
-        <w:rPr>
-          <w:color w:val="333333"/>
-          <w:sz w:val="20"/>
-          <w:szCs w:val="20"/>
-        </w:rPr>
-        <w:t>Schwaner</w:t>
-      </w:r>
-      <w:proofErr w:type="spellEnd"/>
-      <w:r>
-        <w:rPr>
-          <w:color w:val="333333"/>
-          <w:sz w:val="20"/>
-          <w:szCs w:val="20"/>
-        </w:rPr>
-        <w:t xml:space="preserve"> Landscape in West Kalimantan. This assessment utilized a variety of approaches, including the HCV-HCS approach, the STAR Metric, and modeling techniques by COLA Landscape. Additionally, a Population Viability Assessment (PVA) was conducted to assess the impact of the project on the local population.</w:t>
+        <w:t>A High Value Conservation Assessment (HVC) was conducted for the Arabella-Schwaner Landscape in West Kalimantan. This assessment utilized a variety of approaches, including the HCV-HCS approach, the STAR Metric, and modeling techniques by COLA Landscape. Additionally, a Population Viability Assessment (PVA) was conducted to assess the impact of the project on the local population.</w:t>
       </w:r>
     </w:p>
     <w:p>
@@ -1685,7 +1341,16 @@
           <w:sz w:val="20"/>
           <w:szCs w:val="20"/>
         </w:rPr>
-        <w:t>Led the design and implementation of village forest restoration programs in West Kalimantan, systematically testing various methods before standardizing procedures grounded in the Ten Golden Rules for Reforestation. This approach ensured a balanced outcome of carbon sequestration, biodiversity restoration, and livelihood improvement. Two village forests have been successfully implemented, while 20 additional village forests have been designed to sustain and scale these efforts</w:t>
+        <w:t xml:space="preserve">Led the design and implementation of village forest restoration programs in West Kalimantan, systematically testing various methods before standardizing procedures grounded in the Ten Golden Rules </w:t>
+      </w:r>
+      <w:r>
+        <w:rPr>
+          <w:color w:val="333333"/>
+          <w:sz w:val="20"/>
+          <w:szCs w:val="20"/>
+        </w:rPr>
+        <w:lastRenderedPageBreak/>
+        <w:t>for Reforestation. This approach ensured a balanced outcome of carbon sequestration, biodiversity restoration, and livelihood improvement. Two village forests have been successfully implemented, while 20 additional village forests have been designed to sustain and scale these efforts</w:t>
       </w:r>
     </w:p>
     <w:p>
@@ -1714,23 +1379,7 @@
           <w:sz w:val="20"/>
           <w:szCs w:val="20"/>
         </w:rPr>
-        <w:t xml:space="preserve">Contributes a guide for standardizing data management and processing, as well as a biodiversity </w:t>
-      </w:r>
-      <w:r>
-        <w:rPr>
-          <w:color w:val="333333"/>
-          <w:sz w:val="20"/>
-          <w:szCs w:val="20"/>
-        </w:rPr>
-        <w:t xml:space="preserve">and ecology </w:t>
-      </w:r>
-      <w:r>
-        <w:rPr>
-          <w:color w:val="333333"/>
-          <w:sz w:val="20"/>
-          <w:szCs w:val="20"/>
-        </w:rPr>
-        <w:t>assessment methodology for the national level</w:t>
+        <w:t>Contributes a guide for standardizing data management and processing, as well as a biodiversity and ecology assessment methodology for the national level</w:t>
       </w:r>
     </w:p>
     <w:p>
@@ -1759,15 +1408,7 @@
           <w:sz w:val="20"/>
           <w:szCs w:val="20"/>
         </w:rPr>
-        <w:t>Leading MEL (Monitoring, Evaluation &amp; Learning) for the FFI West Kalimantan project</w:t>
-      </w:r>
-      <w:r>
-        <w:rPr>
-          <w:color w:val="333333"/>
-          <w:sz w:val="20"/>
-          <w:szCs w:val="20"/>
-        </w:rPr>
-        <w:t xml:space="preserve"> including analysis and strategy recommendation</w:t>
+        <w:t>Leading MEL (Monitoring, Evaluation &amp; Learning) for the FFI West Kalimantan project including analysis and strategy recommendation</w:t>
       </w:r>
     </w:p>
     <w:p>
@@ -1971,18 +1612,8 @@
                 <w:iCs/>
                 <w:color w:val="1A7575"/>
               </w:rPr>
-              <w:t xml:space="preserve">Fauna &amp; Flora Indonesia </w:t>
-            </w:r>
-            <w:proofErr w:type="spellStart"/>
-            <w:r>
-              <w:rPr>
-                <w:i/>
-                <w:iCs/>
-                <w:color w:val="1A7575"/>
-              </w:rPr>
-              <w:t>Programme</w:t>
-            </w:r>
-            <w:proofErr w:type="spellEnd"/>
+              <w:t>Fauna &amp; Flora Indonesia Programme</w:t>
+            </w:r>
           </w:p>
         </w:tc>
         <w:tc>
@@ -2156,41 +1787,13 @@
                 <w:color w:val="1A7575"/>
               </w:rPr>
             </w:pPr>
-            <w:proofErr w:type="spellStart"/>
             <w:r>
               <w:rPr>
                 <w:i/>
                 <w:iCs/>
                 <w:color w:val="1A7575"/>
               </w:rPr>
-              <w:t>Amfibi</w:t>
-            </w:r>
-            <w:proofErr w:type="spellEnd"/>
-            <w:r>
-              <w:rPr>
-                <w:i/>
-                <w:iCs/>
-                <w:color w:val="1A7575"/>
-              </w:rPr>
-              <w:t xml:space="preserve"> </w:t>
-            </w:r>
-            <w:proofErr w:type="spellStart"/>
-            <w:r>
-              <w:rPr>
-                <w:i/>
-                <w:iCs/>
-                <w:color w:val="1A7575"/>
-              </w:rPr>
-              <w:t>Reptil</w:t>
-            </w:r>
-            <w:proofErr w:type="spellEnd"/>
-            <w:r>
-              <w:rPr>
-                <w:i/>
-                <w:iCs/>
-                <w:color w:val="1A7575"/>
-              </w:rPr>
-              <w:t xml:space="preserve"> Sumatra</w:t>
+              <w:t>Amfibi Reptil Sumatra</w:t>
             </w:r>
           </w:p>
           <w:p>
@@ -2265,151 +1868,17 @@
           <w:sz w:val="20"/>
           <w:szCs w:val="20"/>
         </w:rPr>
-        <w:t xml:space="preserve">Collected herpetofauna data across Java Island (Ujung </w:t>
-      </w:r>
-      <w:proofErr w:type="spellStart"/>
-      <w:r>
-        <w:rPr>
-          <w:color w:val="333333"/>
-          <w:sz w:val="20"/>
-          <w:szCs w:val="20"/>
-        </w:rPr>
-        <w:t>Kulon</w:t>
-      </w:r>
-      <w:proofErr w:type="spellEnd"/>
-      <w:r>
-        <w:rPr>
-          <w:color w:val="333333"/>
-          <w:sz w:val="20"/>
-          <w:szCs w:val="20"/>
-        </w:rPr>
-        <w:t xml:space="preserve">, </w:t>
-      </w:r>
-      <w:proofErr w:type="spellStart"/>
-      <w:r>
-        <w:rPr>
-          <w:color w:val="333333"/>
-          <w:sz w:val="20"/>
-          <w:szCs w:val="20"/>
-        </w:rPr>
-        <w:t>Gunung</w:t>
-      </w:r>
-      <w:proofErr w:type="spellEnd"/>
-      <w:r>
-        <w:rPr>
-          <w:color w:val="333333"/>
-          <w:sz w:val="20"/>
-          <w:szCs w:val="20"/>
-        </w:rPr>
-        <w:t xml:space="preserve"> </w:t>
-      </w:r>
-      <w:proofErr w:type="spellStart"/>
-      <w:r>
-        <w:rPr>
-          <w:color w:val="333333"/>
-          <w:sz w:val="20"/>
-          <w:szCs w:val="20"/>
-        </w:rPr>
-        <w:t>Gede</w:t>
-      </w:r>
-      <w:proofErr w:type="spellEnd"/>
-      <w:r>
-        <w:rPr>
-          <w:color w:val="333333"/>
-          <w:sz w:val="20"/>
-          <w:szCs w:val="20"/>
-        </w:rPr>
-        <w:t xml:space="preserve"> </w:t>
-      </w:r>
-      <w:proofErr w:type="spellStart"/>
-      <w:r>
-        <w:rPr>
-          <w:color w:val="333333"/>
-          <w:sz w:val="20"/>
-          <w:szCs w:val="20"/>
-        </w:rPr>
-        <w:t>Pangrango</w:t>
-      </w:r>
-      <w:proofErr w:type="spellEnd"/>
-      <w:r>
-        <w:rPr>
-          <w:color w:val="333333"/>
-          <w:sz w:val="20"/>
-          <w:szCs w:val="20"/>
-        </w:rPr>
-        <w:t xml:space="preserve">, </w:t>
-      </w:r>
-      <w:proofErr w:type="spellStart"/>
-      <w:r>
-        <w:rPr>
-          <w:color w:val="333333"/>
-          <w:sz w:val="20"/>
-          <w:szCs w:val="20"/>
-        </w:rPr>
-        <w:t>Leuweung</w:t>
-      </w:r>
-      <w:proofErr w:type="spellEnd"/>
-      <w:r>
-        <w:rPr>
-          <w:color w:val="333333"/>
-          <w:sz w:val="20"/>
-          <w:szCs w:val="20"/>
-        </w:rPr>
-        <w:t xml:space="preserve"> </w:t>
-      </w:r>
-      <w:proofErr w:type="spellStart"/>
-      <w:r>
-        <w:rPr>
-          <w:color w:val="333333"/>
-          <w:sz w:val="20"/>
-          <w:szCs w:val="20"/>
-        </w:rPr>
-        <w:t>Sancang</w:t>
-      </w:r>
-      <w:proofErr w:type="spellEnd"/>
-      <w:r>
-        <w:rPr>
-          <w:color w:val="333333"/>
-          <w:sz w:val="20"/>
-          <w:szCs w:val="20"/>
-        </w:rPr>
-        <w:t xml:space="preserve">, </w:t>
-      </w:r>
-      <w:proofErr w:type="spellStart"/>
-      <w:r>
-        <w:rPr>
-          <w:color w:val="333333"/>
-          <w:sz w:val="20"/>
-          <w:szCs w:val="20"/>
-        </w:rPr>
-        <w:t>Gunung</w:t>
-      </w:r>
-      <w:proofErr w:type="spellEnd"/>
-      <w:r>
-        <w:rPr>
-          <w:color w:val="333333"/>
-          <w:sz w:val="20"/>
-          <w:szCs w:val="20"/>
-        </w:rPr>
-        <w:t xml:space="preserve"> </w:t>
-      </w:r>
-      <w:proofErr w:type="spellStart"/>
-      <w:r>
-        <w:rPr>
-          <w:color w:val="333333"/>
-          <w:sz w:val="20"/>
-          <w:szCs w:val="20"/>
-        </w:rPr>
-        <w:t>Slamet</w:t>
-      </w:r>
-      <w:proofErr w:type="spellEnd"/>
-      <w:r>
-        <w:rPr>
-          <w:color w:val="333333"/>
-          <w:sz w:val="20"/>
-          <w:szCs w:val="20"/>
-        </w:rPr>
-        <w:t>)</w:t>
+        <w:t xml:space="preserve">Collected herpetofauna data across Java Island (Ujung Kulon, Gunung Gede Pangrango, Leuweung Sancang, Gunung Slamet), including the first field expedition to record the Gunung Slamet tree frog later described by other researchers as a species new to science, </w:t>
+      </w:r>
+      <w:r>
+        <w:rPr>
+          <w:i/>
+          <w:iCs/>
+          <w:color w:val="333333"/>
+          <w:sz w:val="20"/>
+          <w:szCs w:val="20"/>
+        </w:rPr>
+        <w:t>Zhangixalus faritsalhadii</w:t>
       </w:r>
     </w:p>
     <w:p>
@@ -2467,151 +1936,7 @@
           <w:sz w:val="20"/>
           <w:szCs w:val="20"/>
         </w:rPr>
-        <w:t>Authored and published two scientific books documenting amphibian species: '</w:t>
-      </w:r>
-      <w:proofErr w:type="spellStart"/>
-      <w:r>
-        <w:rPr>
-          <w:color w:val="333333"/>
-          <w:sz w:val="20"/>
-          <w:szCs w:val="20"/>
-        </w:rPr>
-        <w:t>Amfibi</w:t>
-      </w:r>
-      <w:proofErr w:type="spellEnd"/>
-      <w:r>
-        <w:rPr>
-          <w:color w:val="333333"/>
-          <w:sz w:val="20"/>
-          <w:szCs w:val="20"/>
-        </w:rPr>
-        <w:t xml:space="preserve"> di Taman Nasional </w:t>
-      </w:r>
-      <w:proofErr w:type="spellStart"/>
-      <w:r>
-        <w:rPr>
-          <w:color w:val="333333"/>
-          <w:sz w:val="20"/>
-          <w:szCs w:val="20"/>
-        </w:rPr>
-        <w:t>Batang</w:t>
-      </w:r>
-      <w:proofErr w:type="spellEnd"/>
-      <w:r>
-        <w:rPr>
-          <w:color w:val="333333"/>
-          <w:sz w:val="20"/>
-          <w:szCs w:val="20"/>
-        </w:rPr>
-        <w:t xml:space="preserve"> </w:t>
-      </w:r>
-      <w:proofErr w:type="spellStart"/>
-      <w:r>
-        <w:rPr>
-          <w:color w:val="333333"/>
-          <w:sz w:val="20"/>
-          <w:szCs w:val="20"/>
-        </w:rPr>
-        <w:t>Gadis</w:t>
-      </w:r>
-      <w:proofErr w:type="spellEnd"/>
-      <w:r>
-        <w:rPr>
-          <w:color w:val="333333"/>
-          <w:sz w:val="20"/>
-          <w:szCs w:val="20"/>
-        </w:rPr>
-        <w:t xml:space="preserve">' (Amphibians of </w:t>
-      </w:r>
-      <w:proofErr w:type="spellStart"/>
-      <w:r>
-        <w:rPr>
-          <w:color w:val="333333"/>
-          <w:sz w:val="20"/>
-          <w:szCs w:val="20"/>
-        </w:rPr>
-        <w:t>Batang</w:t>
-      </w:r>
-      <w:proofErr w:type="spellEnd"/>
-      <w:r>
-        <w:rPr>
-          <w:color w:val="333333"/>
-          <w:sz w:val="20"/>
-          <w:szCs w:val="20"/>
-        </w:rPr>
-        <w:t xml:space="preserve"> </w:t>
-      </w:r>
-      <w:proofErr w:type="spellStart"/>
-      <w:r>
-        <w:rPr>
-          <w:color w:val="333333"/>
-          <w:sz w:val="20"/>
-          <w:szCs w:val="20"/>
-        </w:rPr>
-        <w:t>Gadis</w:t>
-      </w:r>
-      <w:proofErr w:type="spellEnd"/>
-      <w:r>
-        <w:rPr>
-          <w:color w:val="333333"/>
-          <w:sz w:val="20"/>
-          <w:szCs w:val="20"/>
-        </w:rPr>
-        <w:t xml:space="preserve"> National Park) and '</w:t>
-      </w:r>
-      <w:proofErr w:type="spellStart"/>
-      <w:r>
-        <w:rPr>
-          <w:color w:val="333333"/>
-          <w:sz w:val="20"/>
-          <w:szCs w:val="20"/>
-        </w:rPr>
-        <w:t>Amfibi</w:t>
-      </w:r>
-      <w:proofErr w:type="spellEnd"/>
-      <w:r>
-        <w:rPr>
-          <w:color w:val="333333"/>
-          <w:sz w:val="20"/>
-          <w:szCs w:val="20"/>
-        </w:rPr>
-        <w:t xml:space="preserve"> di </w:t>
-      </w:r>
-      <w:proofErr w:type="spellStart"/>
-      <w:r>
-        <w:rPr>
-          <w:color w:val="333333"/>
-          <w:sz w:val="20"/>
-          <w:szCs w:val="20"/>
-        </w:rPr>
-        <w:t>Pulau</w:t>
-      </w:r>
-      <w:proofErr w:type="spellEnd"/>
-      <w:r>
-        <w:rPr>
-          <w:color w:val="333333"/>
-          <w:sz w:val="20"/>
-          <w:szCs w:val="20"/>
-        </w:rPr>
-        <w:t xml:space="preserve"> </w:t>
-      </w:r>
-      <w:proofErr w:type="spellStart"/>
-      <w:r>
-        <w:rPr>
-          <w:color w:val="333333"/>
-          <w:sz w:val="20"/>
-          <w:szCs w:val="20"/>
-        </w:rPr>
-        <w:t>Jawa</w:t>
-      </w:r>
-      <w:proofErr w:type="spellEnd"/>
-      <w:r>
-        <w:rPr>
-          <w:color w:val="333333"/>
-          <w:sz w:val="20"/>
-          <w:szCs w:val="20"/>
-        </w:rPr>
-        <w:t>' (Amphibians of Java Island), contributing to baseline biodiversity knowledge and conservation reference materials</w:t>
+        <w:t>Authored and published two scientific books documenting amphibian species: 'Amfibi di Taman Nasional Batang Gadis' (Amphibians of Batang Gadis National Park) and 'Amfibi di Pulau Jawa' (Amphibians of Java Island), contributing to baseline biodiversity knowledge and conservation reference materials</w:t>
       </w:r>
     </w:p>
     <w:p>
@@ -2688,23 +2013,7 @@
                 <w:iCs/>
                 <w:color w:val="1A7575"/>
               </w:rPr>
-              <w:t xml:space="preserve">USAID </w:t>
-            </w:r>
-            <w:r>
-              <w:rPr>
-                <w:i/>
-                <w:iCs/>
-                <w:color w:val="1A7575"/>
-              </w:rPr>
-              <w:t>–</w:t>
-            </w:r>
-            <w:r>
-              <w:rPr>
-                <w:i/>
-                <w:iCs/>
-                <w:color w:val="1A7575"/>
-              </w:rPr>
-              <w:t xml:space="preserve"> Lestari</w:t>
+              <w:t>USAID – Lestari</w:t>
             </w:r>
           </w:p>
           <w:p>
@@ -2860,59 +2169,13 @@
                 <w:color w:val="1A7575"/>
               </w:rPr>
             </w:pPr>
-            <w:proofErr w:type="spellStart"/>
             <w:r>
               <w:rPr>
                 <w:i/>
                 <w:iCs/>
                 <w:color w:val="1A7575"/>
               </w:rPr>
-              <w:t>Pesona</w:t>
-            </w:r>
-            <w:proofErr w:type="spellEnd"/>
-            <w:r>
-              <w:rPr>
-                <w:i/>
-                <w:iCs/>
-                <w:color w:val="1A7575"/>
-              </w:rPr>
-              <w:t xml:space="preserve"> </w:t>
-            </w:r>
-            <w:proofErr w:type="spellStart"/>
-            <w:r>
-              <w:rPr>
-                <w:i/>
-                <w:iCs/>
-                <w:color w:val="1A7575"/>
-              </w:rPr>
-              <w:t>Tropis</w:t>
-            </w:r>
-            <w:proofErr w:type="spellEnd"/>
-            <w:r>
-              <w:rPr>
-                <w:i/>
-                <w:iCs/>
-                <w:color w:val="1A7575"/>
-              </w:rPr>
-              <w:t xml:space="preserve"> </w:t>
-            </w:r>
-            <w:proofErr w:type="spellStart"/>
-            <w:r>
-              <w:rPr>
-                <w:i/>
-                <w:iCs/>
-                <w:color w:val="1A7575"/>
-              </w:rPr>
-              <w:t>Alam</w:t>
-            </w:r>
-            <w:proofErr w:type="spellEnd"/>
-            <w:r>
-              <w:rPr>
-                <w:i/>
-                <w:iCs/>
-                <w:color w:val="1A7575"/>
-              </w:rPr>
-              <w:t xml:space="preserve"> Indonesia (PETAI)</w:t>
+              <w:t>Pesona Tropis Alam Indonesia (PETAI)</w:t>
             </w:r>
           </w:p>
           <w:p>
@@ -2960,27 +2223,7 @@
                 <w:sz w:val="20"/>
                 <w:szCs w:val="20"/>
               </w:rPr>
-              <w:t>201</w:t>
-            </w:r>
-            <w:r>
-              <w:rPr>
-                <w:b/>
-                <w:bCs/>
-                <w:color w:val="C9A227"/>
-                <w:sz w:val="20"/>
-                <w:szCs w:val="20"/>
-              </w:rPr>
-              <w:t>5</w:t>
-            </w:r>
-            <w:r>
-              <w:rPr>
-                <w:b/>
-                <w:bCs/>
-                <w:color w:val="C9A227"/>
-                <w:sz w:val="20"/>
-                <w:szCs w:val="20"/>
-              </w:rPr>
-              <w:t xml:space="preserve"> – 2017</w:t>
+              <w:t>2015 – 2017</w:t>
             </w:r>
           </w:p>
         </w:tc>
@@ -3007,25 +2250,8 @@
           <w:sz w:val="20"/>
           <w:szCs w:val="20"/>
         </w:rPr>
-        <w:t xml:space="preserve">Facilitated social forestry permit acquisition in </w:t>
-      </w:r>
-      <w:proofErr w:type="spellStart"/>
-      <w:r>
-        <w:rPr>
-          <w:color w:val="333333"/>
-          <w:sz w:val="20"/>
-          <w:szCs w:val="20"/>
-        </w:rPr>
-        <w:t>Pakpak</w:t>
-      </w:r>
-      <w:proofErr w:type="spellEnd"/>
-      <w:r>
-        <w:rPr>
-          <w:color w:val="333333"/>
-          <w:sz w:val="20"/>
-          <w:szCs w:val="20"/>
-        </w:rPr>
-        <w:t xml:space="preserve"> Bharat District, North Sumatra</w:t>
+        <w:lastRenderedPageBreak/>
+        <w:t>Facilitated social forestry permit acquisition in Pakpak Bharat District, North Sumatra</w:t>
       </w:r>
     </w:p>
     <w:p>
@@ -3080,190 +2306,281 @@
           <w:sz w:val="20"/>
           <w:szCs w:val="20"/>
         </w:rPr>
-        <w:t>Contributed to the facilitation of Social Forestry (</w:t>
-      </w:r>
-      <w:proofErr w:type="spellStart"/>
-      <w:r>
-        <w:rPr>
-          <w:color w:val="333333"/>
-          <w:sz w:val="20"/>
-          <w:szCs w:val="20"/>
-        </w:rPr>
-        <w:t>Perhutanan</w:t>
-      </w:r>
-      <w:proofErr w:type="spellEnd"/>
-      <w:r>
-        <w:rPr>
-          <w:color w:val="333333"/>
-          <w:sz w:val="20"/>
-          <w:szCs w:val="20"/>
-        </w:rPr>
-        <w:t xml:space="preserve"> </w:t>
-      </w:r>
-      <w:proofErr w:type="spellStart"/>
-      <w:r>
-        <w:rPr>
-          <w:color w:val="333333"/>
-          <w:sz w:val="20"/>
-          <w:szCs w:val="20"/>
-        </w:rPr>
-        <w:t>Sosial</w:t>
-      </w:r>
-      <w:proofErr w:type="spellEnd"/>
-      <w:r>
-        <w:rPr>
-          <w:color w:val="333333"/>
-          <w:sz w:val="20"/>
-          <w:szCs w:val="20"/>
-        </w:rPr>
-        <w:t xml:space="preserve"> – </w:t>
-      </w:r>
-      <w:proofErr w:type="spellStart"/>
-      <w:r>
-        <w:rPr>
-          <w:color w:val="333333"/>
-          <w:sz w:val="20"/>
-          <w:szCs w:val="20"/>
-        </w:rPr>
-        <w:t>HKm</w:t>
-      </w:r>
-      <w:proofErr w:type="spellEnd"/>
-      <w:r>
-        <w:rPr>
-          <w:color w:val="333333"/>
-          <w:sz w:val="20"/>
-          <w:szCs w:val="20"/>
-        </w:rPr>
-        <w:t xml:space="preserve">) permit application for three villages in </w:t>
-      </w:r>
-      <w:proofErr w:type="spellStart"/>
-      <w:r>
-        <w:rPr>
-          <w:color w:val="333333"/>
-          <w:sz w:val="20"/>
-          <w:szCs w:val="20"/>
-        </w:rPr>
-        <w:t>Pakpak</w:t>
-      </w:r>
-      <w:proofErr w:type="spellEnd"/>
-      <w:r>
-        <w:rPr>
-          <w:color w:val="333333"/>
-          <w:sz w:val="20"/>
-          <w:szCs w:val="20"/>
-        </w:rPr>
-        <w:t xml:space="preserve"> Bharat (</w:t>
-      </w:r>
-      <w:proofErr w:type="spellStart"/>
-      <w:r>
-        <w:rPr>
-          <w:color w:val="333333"/>
-          <w:sz w:val="20"/>
-          <w:szCs w:val="20"/>
-        </w:rPr>
-        <w:t>Desa</w:t>
-      </w:r>
-      <w:proofErr w:type="spellEnd"/>
-      <w:r>
-        <w:rPr>
-          <w:color w:val="333333"/>
-          <w:sz w:val="20"/>
-          <w:szCs w:val="20"/>
-        </w:rPr>
-        <w:t xml:space="preserve"> </w:t>
-      </w:r>
-      <w:proofErr w:type="spellStart"/>
-      <w:r>
-        <w:rPr>
-          <w:color w:val="333333"/>
-          <w:sz w:val="20"/>
-          <w:szCs w:val="20"/>
-        </w:rPr>
-        <w:t>Aornakan</w:t>
-      </w:r>
-      <w:proofErr w:type="spellEnd"/>
-      <w:r>
-        <w:rPr>
-          <w:color w:val="333333"/>
-          <w:sz w:val="20"/>
-          <w:szCs w:val="20"/>
-        </w:rPr>
-        <w:t xml:space="preserve"> I, </w:t>
-      </w:r>
-      <w:proofErr w:type="spellStart"/>
-      <w:r>
-        <w:rPr>
-          <w:color w:val="333333"/>
-          <w:sz w:val="20"/>
-          <w:szCs w:val="20"/>
-        </w:rPr>
-        <w:t>Desa</w:t>
-      </w:r>
-      <w:proofErr w:type="spellEnd"/>
-      <w:r>
-        <w:rPr>
-          <w:color w:val="333333"/>
-          <w:sz w:val="20"/>
-          <w:szCs w:val="20"/>
-        </w:rPr>
-        <w:t xml:space="preserve"> </w:t>
-      </w:r>
-      <w:proofErr w:type="spellStart"/>
-      <w:r>
-        <w:rPr>
-          <w:color w:val="333333"/>
-          <w:sz w:val="20"/>
-          <w:szCs w:val="20"/>
-        </w:rPr>
-        <w:t>Kuta</w:t>
-      </w:r>
-      <w:proofErr w:type="spellEnd"/>
-      <w:r>
-        <w:rPr>
-          <w:color w:val="333333"/>
-          <w:sz w:val="20"/>
-          <w:szCs w:val="20"/>
-        </w:rPr>
-        <w:t xml:space="preserve"> Tinggi, and </w:t>
-      </w:r>
-      <w:proofErr w:type="spellStart"/>
-      <w:r>
-        <w:rPr>
-          <w:color w:val="333333"/>
-          <w:sz w:val="20"/>
-          <w:szCs w:val="20"/>
-        </w:rPr>
-        <w:t>Desa</w:t>
-      </w:r>
-      <w:proofErr w:type="spellEnd"/>
-      <w:r>
-        <w:rPr>
-          <w:color w:val="333333"/>
-          <w:sz w:val="20"/>
-          <w:szCs w:val="20"/>
-        </w:rPr>
-        <w:t xml:space="preserve"> </w:t>
-      </w:r>
-      <w:proofErr w:type="spellStart"/>
-      <w:r>
-        <w:rPr>
-          <w:color w:val="333333"/>
-          <w:sz w:val="20"/>
-          <w:szCs w:val="20"/>
-        </w:rPr>
-        <w:t>Sibongkaras</w:t>
-      </w:r>
-      <w:proofErr w:type="spellEnd"/>
-      <w:r>
-        <w:rPr>
-          <w:color w:val="333333"/>
-          <w:sz w:val="20"/>
-          <w:szCs w:val="20"/>
-        </w:rPr>
-        <w:t>), providing direct assistance to farmer groups throughout the permit submission process to the Ministry of Environment and Forestry (KLHK)</w:t>
+        <w:t>Contributed to the facilitation of Social Forestry (Perhutanan Sosial – HKm) permit application for three villages in Pakpak Bharat (Desa Aornakan I, Desa Kuta Tinggi, and Desa Sibongkaras), providing direct assistance to farmer groups throughout the permit submission process to the Ministry of Environment and Forestry (KLHK)</w:t>
       </w:r>
     </w:p>
     <w:p/>
+    <w:p/>
+    <w:tbl>
+      <w:tblPr>
+        <w:tblStyle w:val="a3"/>
+        <w:tblW w:w="9360" w:type="dxa"/>
+        <w:tblInd w:w="0" w:type="dxa"/>
+        <w:tblBorders>
+          <w:top w:val="single" w:sz="4" w:space="0" w:color="000000"/>
+          <w:left w:val="single" w:sz="4" w:space="0" w:color="000000"/>
+          <w:bottom w:val="single" w:sz="4" w:space="0" w:color="000000"/>
+          <w:right w:val="single" w:sz="4" w:space="0" w:color="000000"/>
+          <w:insideH w:val="single" w:sz="4" w:space="0" w:color="000000"/>
+          <w:insideV w:val="single" w:sz="4" w:space="0" w:color="000000"/>
+        </w:tblBorders>
+        <w:tblLayout w:type="fixed"/>
+        <w:tblLook w:val="0000" w:firstRow="0" w:lastRow="0" w:firstColumn="0" w:lastColumn="0" w:noHBand="0" w:noVBand="0"/>
+      </w:tblPr>
+      <w:tblGrid>
+        <w:gridCol w:w="9360"/>
+      </w:tblGrid>
+      <w:tr>
+        <w:tc>
+          <w:tcPr>
+            <w:tcW w:w="9360" w:type="dxa"/>
+            <w:tcBorders>
+              <w:top w:val="nil"/>
+              <w:left w:val="nil"/>
+              <w:bottom w:val="nil"/>
+              <w:right w:val="nil"/>
+            </w:tcBorders>
+            <w:shd w:val="clear" w:color="auto" w:fill="4A442A" w:themeFill="background2" w:themeFillShade="40"/>
+          </w:tcPr>
+          <w:p>
+            <w:pPr>
+              <w:spacing w:before="120" w:after="120"/>
+              <w:ind w:left="200"/>
+            </w:pPr>
+            <w:r>
+              <w:rPr>
+                <w:rFonts w:ascii="Georgia" w:eastAsia="Georgia" w:hAnsi="Georgia" w:cs="Georgia"/>
+                <w:b/>
+                <w:bCs/>
+                <w:color w:val="FFFFFF"/>
+                <w:sz w:val="26"/>
+                <w:szCs w:val="26"/>
+              </w:rPr>
+              <w:t>PART-TIME CONSULTING</w:t>
+            </w:r>
+          </w:p>
+        </w:tc>
+      </w:tr>
+    </w:tbl>
+    <w:tbl>
+      <w:tblPr>
+        <w:tblStyle w:val="a4"/>
+        <w:tblW w:w="9360" w:type="dxa"/>
+        <w:tblInd w:w="0" w:type="dxa"/>
+        <w:tblBorders>
+          <w:top w:val="single" w:sz="4" w:space="0" w:color="000000"/>
+          <w:left w:val="single" w:sz="4" w:space="0" w:color="000000"/>
+          <w:bottom w:val="single" w:sz="4" w:space="0" w:color="000000"/>
+          <w:right w:val="single" w:sz="4" w:space="0" w:color="000000"/>
+          <w:insideH w:val="single" w:sz="4" w:space="0" w:color="000000"/>
+          <w:insideV w:val="single" w:sz="4" w:space="0" w:color="000000"/>
+        </w:tblBorders>
+        <w:tblLayout w:type="fixed"/>
+        <w:tblLook w:val="0000" w:firstRow="0" w:lastRow="0" w:firstColumn="0" w:lastColumn="0" w:noHBand="0" w:noVBand="0"/>
+      </w:tblPr>
+      <w:tblGrid>
+        <w:gridCol w:w="6500"/>
+        <w:gridCol w:w="2860"/>
+      </w:tblGrid>
+      <w:tr>
+        <w:tc>
+          <w:tcPr>
+            <w:tcW w:w="6500" w:type="dxa"/>
+            <w:tcBorders>
+              <w:top w:val="nil"/>
+              <w:left w:val="nil"/>
+              <w:bottom w:val="nil"/>
+              <w:right w:val="nil"/>
+            </w:tcBorders>
+          </w:tcPr>
+          <w:p>
+            <w:pPr>
+              <w:spacing w:before="120"/>
+            </w:pPr>
+            <w:r>
+              <w:rPr>
+                <w:rFonts w:ascii="Georgia" w:eastAsia="Georgia" w:hAnsi="Georgia" w:cs="Georgia"/>
+                <w:b/>
+                <w:bCs/>
+                <w:color w:val="0D4F4F"/>
+                <w:sz w:val="26"/>
+                <w:szCs w:val="26"/>
+              </w:rPr>
+              <w:t>Biodiversity &amp; MEL Specialist</w:t>
+            </w:r>
+          </w:p>
+          <w:p>
+            <w:r>
+              <w:rPr>
+                <w:i/>
+                <w:iCs/>
+                <w:color w:val="1A7575"/>
+              </w:rPr>
+              <w:t>PT Terra Equity Impact (Independent / Part-time)</w:t>
+            </w:r>
+          </w:p>
+        </w:tc>
+        <w:tc>
+          <w:tcPr>
+            <w:tcW w:w="2860" w:type="dxa"/>
+            <w:tcBorders>
+              <w:top w:val="nil"/>
+              <w:left w:val="nil"/>
+              <w:bottom w:val="nil"/>
+              <w:right w:val="nil"/>
+            </w:tcBorders>
+            <w:vAlign w:val="center"/>
+          </w:tcPr>
+          <w:p>
+            <w:pPr>
+              <w:jc w:val="right"/>
+            </w:pPr>
+            <w:r>
+              <w:rPr>
+                <w:b/>
+                <w:bCs/>
+                <w:color w:val="C9A227"/>
+                <w:sz w:val="20"/>
+                <w:szCs w:val="20"/>
+              </w:rPr>
+              <w:t>Oct 2025 – Present</w:t>
+            </w:r>
+          </w:p>
+        </w:tc>
+      </w:tr>
+    </w:tbl>
+    <w:p>
+      <w:pPr>
+        <w:spacing w:before="120"/>
+        <w:ind w:left="90"/>
+      </w:pPr>
+      <w:r>
+        <w:rPr>
+          <w:b/>
+          <w:bCs/>
+          <w:color w:val="333333"/>
+          <w:sz w:val="20"/>
+          <w:szCs w:val="20"/>
+        </w:rPr>
+        <w:t>Key Achievements:</w:t>
+      </w:r>
+    </w:p>
+    <w:p>
+      <w:pPr>
+        <w:numPr>
+          <w:ilvl w:val="0"/>
+          <w:numId w:val="2"/>
+        </w:numPr>
+        <w:pBdr>
+          <w:top w:val="nil"/>
+          <w:left w:val="nil"/>
+          <w:bottom w:val="nil"/>
+          <w:right w:val="nil"/>
+          <w:between w:val="nil"/>
+        </w:pBdr>
+        <w:ind w:right="1106"/>
+        <w:rPr>
+          <w:color w:val="333333"/>
+          <w:sz w:val="20"/>
+          <w:szCs w:val="20"/>
+        </w:rPr>
+      </w:pPr>
+      <w:r>
+        <w:rPr>
+          <w:color w:val="333333"/>
+          <w:sz w:val="20"/>
+          <w:szCs w:val="20"/>
+        </w:rPr>
+        <w:t>Engaged as an independent paid specialist (tenaga ahli), providing biodiversity assessment and Monitoring, Evaluation &amp; Learning (MEL) support for forest-carbon and biodiversity investment projects</w:t>
+      </w:r>
+    </w:p>
+    <w:p>
+      <w:pPr>
+        <w:numPr>
+          <w:ilvl w:val="0"/>
+          <w:numId w:val="2"/>
+        </w:numPr>
+        <w:pBdr>
+          <w:top w:val="nil"/>
+          <w:left w:val="nil"/>
+          <w:bottom w:val="nil"/>
+          <w:right w:val="nil"/>
+          <w:between w:val="nil"/>
+        </w:pBdr>
+        <w:ind w:right="1106"/>
+        <w:rPr>
+          <w:color w:val="333333"/>
+          <w:sz w:val="20"/>
+          <w:szCs w:val="20"/>
+        </w:rPr>
+      </w:pPr>
+      <w:r>
+        <w:rPr>
+          <w:color w:val="333333"/>
+          <w:sz w:val="20"/>
+          <w:szCs w:val="20"/>
+        </w:rPr>
+        <w:t>Assessed forest eligibility against internationally accepted definitions (UNFCCC, FAO, and IPCC), covering thresholds such as minimum forest area, tree height, and crown cover across mature, secondary, degraded, and wetland forests</w:t>
+      </w:r>
+    </w:p>
+    <w:p>
+      <w:pPr>
+        <w:numPr>
+          <w:ilvl w:val="0"/>
+          <w:numId w:val="2"/>
+        </w:numPr>
+        <w:pBdr>
+          <w:top w:val="nil"/>
+          <w:left w:val="nil"/>
+          <w:bottom w:val="nil"/>
+          <w:right w:val="nil"/>
+          <w:between w:val="nil"/>
+        </w:pBdr>
+        <w:ind w:right="1106"/>
+        <w:rPr>
+          <w:color w:val="333333"/>
+          <w:sz w:val="20"/>
+          <w:szCs w:val="20"/>
+        </w:rPr>
+      </w:pPr>
+      <w:r>
+        <w:rPr>
+          <w:color w:val="333333"/>
+          <w:sz w:val="20"/>
+          <w:szCs w:val="20"/>
+        </w:rPr>
+        <w:t>Contributed to the verification and monitoring of forest-carbon projects spanning REDD (reduced emissions from deforestation and forest degradation), ARR (afforestation, reforestation and revegetation), and IFM (improved forest management) activities under the VCS Program</w:t>
+      </w:r>
+    </w:p>
+    <w:p>
+      <w:pPr>
+        <w:numPr>
+          <w:ilvl w:val="0"/>
+          <w:numId w:val="2"/>
+        </w:numPr>
+        <w:pBdr>
+          <w:top w:val="nil"/>
+          <w:left w:val="nil"/>
+          <w:bottom w:val="nil"/>
+          <w:right w:val="nil"/>
+          <w:between w:val="nil"/>
+        </w:pBdr>
+        <w:ind w:right="1106"/>
+        <w:rPr>
+          <w:color w:val="333333"/>
+          <w:sz w:val="20"/>
+          <w:szCs w:val="20"/>
+        </w:rPr>
+      </w:pPr>
+      <w:r>
+        <w:rPr>
+          <w:color w:val="333333"/>
+          <w:sz w:val="20"/>
+          <w:szCs w:val="20"/>
+        </w:rPr>
+        <w:t>Delivered biodiversity monitoring and verification reports for the BKT Bahenap VF, AHI Mentari Huluan Jambi, and KBCF Himba Lestari projects, turning field data into standard and investor-ready documentation</w:t>
+      </w:r>
+    </w:p>
     <w:p/>
     <w:tbl>
       <w:tblPr>
@@ -3339,7 +2656,6 @@
           <w:between w:val="nil"/>
         </w:pBdr>
       </w:pPr>
-      <w:proofErr w:type="spellStart"/>
       <w:r>
         <w:rPr>
           <w:i/>
@@ -3348,53 +2664,8 @@
           <w:sz w:val="21"/>
           <w:szCs w:val="21"/>
         </w:rPr>
-        <w:t>Amfibi</w:t>
-      </w:r>
-      <w:proofErr w:type="spellEnd"/>
-      <w:r>
-        <w:rPr>
-          <w:i/>
-          <w:iCs/>
-          <w:color w:val="333333"/>
-          <w:sz w:val="21"/>
-          <w:szCs w:val="21"/>
-        </w:rPr>
-        <w:t xml:space="preserve"> di Taman Nasional </w:t>
-      </w:r>
-      <w:proofErr w:type="spellStart"/>
-      <w:r>
-        <w:rPr>
-          <w:i/>
-          <w:iCs/>
-          <w:color w:val="333333"/>
-          <w:sz w:val="21"/>
-          <w:szCs w:val="21"/>
-        </w:rPr>
-        <w:t>Batang</w:t>
-      </w:r>
-      <w:proofErr w:type="spellEnd"/>
-      <w:r>
-        <w:rPr>
-          <w:i/>
-          <w:iCs/>
-          <w:color w:val="333333"/>
-          <w:sz w:val="21"/>
-          <w:szCs w:val="21"/>
-        </w:rPr>
-        <w:t xml:space="preserve"> </w:t>
-      </w:r>
-      <w:proofErr w:type="spellStart"/>
-      <w:r>
-        <w:rPr>
-          <w:i/>
-          <w:iCs/>
-          <w:color w:val="333333"/>
-          <w:sz w:val="21"/>
-          <w:szCs w:val="21"/>
-        </w:rPr>
-        <w:t>Gadis</w:t>
-      </w:r>
-      <w:proofErr w:type="spellEnd"/>
+        <w:t>Amfibi di Taman Nasional Batang Gadis</w:t>
+      </w:r>
       <w:r>
         <w:rPr>
           <w:color w:val="666666"/>
@@ -3418,7 +2689,6 @@
           <w:between w:val="nil"/>
         </w:pBdr>
       </w:pPr>
-      <w:proofErr w:type="spellStart"/>
       <w:r>
         <w:rPr>
           <w:i/>
@@ -3427,97 +2697,8 @@
           <w:sz w:val="21"/>
           <w:szCs w:val="21"/>
         </w:rPr>
-        <w:t>Amfibi</w:t>
-      </w:r>
-      <w:proofErr w:type="spellEnd"/>
-      <w:r>
-        <w:rPr>
-          <w:i/>
-          <w:iCs/>
-          <w:color w:val="333333"/>
-          <w:sz w:val="21"/>
-          <w:szCs w:val="21"/>
-        </w:rPr>
-        <w:t xml:space="preserve"> </w:t>
-      </w:r>
-      <w:proofErr w:type="spellStart"/>
-      <w:r>
-        <w:rPr>
-          <w:i/>
-          <w:iCs/>
-          <w:color w:val="333333"/>
-          <w:sz w:val="21"/>
-          <w:szCs w:val="21"/>
-        </w:rPr>
-        <w:t>Pulau</w:t>
-      </w:r>
-      <w:proofErr w:type="spellEnd"/>
-      <w:r>
-        <w:rPr>
-          <w:i/>
-          <w:iCs/>
-          <w:color w:val="333333"/>
-          <w:sz w:val="21"/>
-          <w:szCs w:val="21"/>
-        </w:rPr>
-        <w:t xml:space="preserve"> </w:t>
-      </w:r>
-      <w:proofErr w:type="spellStart"/>
-      <w:r>
-        <w:rPr>
-          <w:i/>
-          <w:iCs/>
-          <w:color w:val="333333"/>
-          <w:sz w:val="21"/>
-          <w:szCs w:val="21"/>
-        </w:rPr>
-        <w:t>Jawa</w:t>
-      </w:r>
-      <w:proofErr w:type="spellEnd"/>
-      <w:r>
-        <w:rPr>
-          <w:i/>
-          <w:iCs/>
-          <w:color w:val="333333"/>
-          <w:sz w:val="21"/>
-          <w:szCs w:val="21"/>
-        </w:rPr>
-        <w:t xml:space="preserve"> - Panduan </w:t>
-      </w:r>
-      <w:proofErr w:type="spellStart"/>
-      <w:r>
-        <w:rPr>
-          <w:i/>
-          <w:iCs/>
-          <w:color w:val="333333"/>
-          <w:sz w:val="21"/>
-          <w:szCs w:val="21"/>
-        </w:rPr>
-        <w:t>Bergambar</w:t>
-      </w:r>
-      <w:proofErr w:type="spellEnd"/>
-      <w:r>
-        <w:rPr>
-          <w:i/>
-          <w:iCs/>
-          <w:color w:val="333333"/>
-          <w:sz w:val="21"/>
-          <w:szCs w:val="21"/>
-        </w:rPr>
-        <w:t xml:space="preserve"> dan </w:t>
-      </w:r>
-      <w:proofErr w:type="spellStart"/>
-      <w:r>
-        <w:rPr>
-          <w:i/>
-          <w:iCs/>
-          <w:color w:val="333333"/>
-          <w:sz w:val="21"/>
-          <w:szCs w:val="21"/>
-        </w:rPr>
-        <w:t>Identifikasi</w:t>
-      </w:r>
-      <w:proofErr w:type="spellEnd"/>
+        <w:t>Amfibi Pulau Jawa - Panduan Bergambar dan Identifikasi</w:t>
+      </w:r>
       <w:r>
         <w:rPr>
           <w:color w:val="666666"/>
@@ -3541,7 +2722,6 @@
           <w:between w:val="nil"/>
         </w:pBdr>
       </w:pPr>
-      <w:proofErr w:type="spellStart"/>
       <w:r>
         <w:rPr>
           <w:i/>
@@ -3550,75 +2730,8 @@
           <w:sz w:val="21"/>
           <w:szCs w:val="21"/>
         </w:rPr>
-        <w:t>Seraut</w:t>
-      </w:r>
-      <w:proofErr w:type="spellEnd"/>
-      <w:r>
-        <w:rPr>
-          <w:i/>
-          <w:iCs/>
-          <w:color w:val="333333"/>
-          <w:sz w:val="21"/>
-          <w:szCs w:val="21"/>
-        </w:rPr>
-        <w:t xml:space="preserve"> </w:t>
-      </w:r>
-      <w:proofErr w:type="spellStart"/>
-      <w:r>
-        <w:rPr>
-          <w:i/>
-          <w:iCs/>
-          <w:color w:val="333333"/>
-          <w:sz w:val="21"/>
-          <w:szCs w:val="21"/>
-        </w:rPr>
-        <w:t>Suaka</w:t>
-      </w:r>
-      <w:proofErr w:type="spellEnd"/>
-      <w:r>
-        <w:rPr>
-          <w:i/>
-          <w:iCs/>
-          <w:color w:val="333333"/>
-          <w:sz w:val="21"/>
-          <w:szCs w:val="21"/>
-        </w:rPr>
-        <w:t xml:space="preserve"> di </w:t>
-      </w:r>
-      <w:proofErr w:type="spellStart"/>
-      <w:r>
-        <w:rPr>
-          <w:i/>
-          <w:iCs/>
-          <w:color w:val="333333"/>
-          <w:sz w:val="21"/>
-          <w:szCs w:val="21"/>
-        </w:rPr>
-        <w:t>Hutan</w:t>
-      </w:r>
-      <w:proofErr w:type="spellEnd"/>
-      <w:r>
-        <w:rPr>
-          <w:i/>
-          <w:iCs/>
-          <w:color w:val="333333"/>
-          <w:sz w:val="21"/>
-          <w:szCs w:val="21"/>
-        </w:rPr>
-        <w:t xml:space="preserve"> </w:t>
-      </w:r>
-      <w:proofErr w:type="spellStart"/>
-      <w:r>
-        <w:rPr>
-          <w:i/>
-          <w:iCs/>
-          <w:color w:val="333333"/>
-          <w:sz w:val="21"/>
-          <w:szCs w:val="21"/>
-        </w:rPr>
-        <w:t>Gambut</w:t>
-      </w:r>
-      <w:proofErr w:type="spellEnd"/>
+        <w:t>Seraut Suaka di Hutan Gambut</w:t>
+      </w:r>
       <w:r>
         <w:rPr>
           <w:color w:val="666666"/>
@@ -3642,7 +2755,6 @@
           <w:between w:val="nil"/>
         </w:pBdr>
       </w:pPr>
-      <w:proofErr w:type="spellStart"/>
       <w:r>
         <w:rPr>
           <w:i/>
@@ -3651,84 +2763,7 @@
           <w:sz w:val="21"/>
           <w:szCs w:val="21"/>
         </w:rPr>
-        <w:t>Prosedur</w:t>
-      </w:r>
-      <w:proofErr w:type="spellEnd"/>
-      <w:r>
-        <w:rPr>
-          <w:i/>
-          <w:iCs/>
-          <w:color w:val="333333"/>
-          <w:sz w:val="21"/>
-          <w:szCs w:val="21"/>
-        </w:rPr>
-        <w:t xml:space="preserve"> </w:t>
-      </w:r>
-      <w:proofErr w:type="spellStart"/>
-      <w:r>
-        <w:rPr>
-          <w:i/>
-          <w:iCs/>
-          <w:color w:val="333333"/>
-          <w:sz w:val="21"/>
-          <w:szCs w:val="21"/>
-        </w:rPr>
-        <w:t>Tetap</w:t>
-      </w:r>
-      <w:proofErr w:type="spellEnd"/>
-      <w:r>
-        <w:rPr>
-          <w:i/>
-          <w:iCs/>
-          <w:color w:val="333333"/>
-          <w:sz w:val="21"/>
-          <w:szCs w:val="21"/>
-        </w:rPr>
-        <w:t xml:space="preserve"> </w:t>
-      </w:r>
-      <w:proofErr w:type="spellStart"/>
-      <w:r>
-        <w:rPr>
-          <w:i/>
-          <w:iCs/>
-          <w:color w:val="333333"/>
-          <w:sz w:val="21"/>
-          <w:szCs w:val="21"/>
-        </w:rPr>
-        <w:t>Patroli</w:t>
-      </w:r>
-      <w:proofErr w:type="spellEnd"/>
-      <w:r>
-        <w:rPr>
-          <w:i/>
-          <w:iCs/>
-          <w:color w:val="333333"/>
-          <w:sz w:val="21"/>
-          <w:szCs w:val="21"/>
-        </w:rPr>
-        <w:t xml:space="preserve"> Kawasan </w:t>
-      </w:r>
-      <w:proofErr w:type="spellStart"/>
-      <w:r>
-        <w:rPr>
-          <w:i/>
-          <w:iCs/>
-          <w:color w:val="333333"/>
-          <w:sz w:val="21"/>
-          <w:szCs w:val="21"/>
-        </w:rPr>
-        <w:t>Berbasis</w:t>
-      </w:r>
-      <w:proofErr w:type="spellEnd"/>
-      <w:r>
-        <w:rPr>
-          <w:i/>
-          <w:iCs/>
-          <w:color w:val="333333"/>
-          <w:sz w:val="21"/>
-          <w:szCs w:val="21"/>
-        </w:rPr>
-        <w:t xml:space="preserve"> SMART</w:t>
+        <w:t>Prosedur Tetap Patroli Kawasan Berbasis SMART</w:t>
       </w:r>
       <w:r>
         <w:rPr>
@@ -3736,18 +2771,8 @@
           <w:sz w:val="21"/>
           <w:szCs w:val="21"/>
         </w:rPr>
-        <w:t xml:space="preserve"> – Fauna &amp; Flora Indonesia </w:t>
-      </w:r>
-      <w:proofErr w:type="spellStart"/>
-      <w:r>
-        <w:rPr>
-          <w:color w:val="666666"/>
-          <w:sz w:val="21"/>
-          <w:szCs w:val="21"/>
-        </w:rPr>
-        <w:t>Programme</w:t>
-      </w:r>
-      <w:proofErr w:type="spellEnd"/>
+        <w:t xml:space="preserve"> – Fauna &amp; Flora Indonesia Programme</w:t>
+      </w:r>
     </w:p>
     <w:p>
       <w:pPr>
@@ -3762,6 +2787,8 @@
           <w:right w:val="nil"/>
           <w:between w:val="nil"/>
         </w:pBdr>
+        <w:ind w:left="548" w:hanging="274"/>
+        <w:contextualSpacing/>
         <w:rPr>
           <w:sz w:val="21"/>
           <w:szCs w:val="21"/>
@@ -3775,51 +2802,7 @@
           <w:sz w:val="21"/>
           <w:szCs w:val="21"/>
         </w:rPr>
-        <w:t xml:space="preserve">Panduan </w:t>
-      </w:r>
-      <w:proofErr w:type="spellStart"/>
-      <w:r>
-        <w:rPr>
-          <w:i/>
-          <w:iCs/>
-          <w:color w:val="434343"/>
-          <w:sz w:val="21"/>
-          <w:szCs w:val="21"/>
-        </w:rPr>
-        <w:t>Kehati</w:t>
-      </w:r>
-      <w:proofErr w:type="spellEnd"/>
-      <w:r>
-        <w:rPr>
-          <w:i/>
-          <w:iCs/>
-          <w:color w:val="434343"/>
-          <w:sz w:val="21"/>
-          <w:szCs w:val="21"/>
-        </w:rPr>
-        <w:t xml:space="preserve"> - Fauna &amp; Flora Indonesia </w:t>
-      </w:r>
-      <w:proofErr w:type="spellStart"/>
-      <w:r>
-        <w:rPr>
-          <w:i/>
-          <w:iCs/>
-          <w:color w:val="434343"/>
-          <w:sz w:val="21"/>
-          <w:szCs w:val="21"/>
-        </w:rPr>
-        <w:t>Programme</w:t>
-      </w:r>
-      <w:proofErr w:type="spellEnd"/>
-      <w:r>
-        <w:rPr>
-          <w:i/>
-          <w:iCs/>
-          <w:color w:val="434343"/>
-          <w:sz w:val="21"/>
-          <w:szCs w:val="21"/>
-        </w:rPr>
-        <w:t xml:space="preserve"> (</w:t>
+        <w:t>Panduan Kehati - Fauna &amp; Flora Indonesia Programme (</w:t>
       </w:r>
       <w:hyperlink r:id="rId11">
         <w:r>
@@ -3831,45 +2814,8 @@
             <w:szCs w:val="21"/>
             <w:u w:val="single"/>
           </w:rPr>
-          <w:t xml:space="preserve">Panduan </w:t>
+          <w:t>Panduan Survei Kehati</w:t>
         </w:r>
-        <w:proofErr w:type="spellStart"/>
-        <w:r>
-          <w:rPr>
-            <w:i/>
-            <w:iCs/>
-            <w:color w:val="434343"/>
-            <w:sz w:val="21"/>
-            <w:szCs w:val="21"/>
-            <w:u w:val="single"/>
-          </w:rPr>
-          <w:t>Survei</w:t>
-        </w:r>
-        <w:proofErr w:type="spellEnd"/>
-        <w:r>
-          <w:rPr>
-            <w:i/>
-            <w:iCs/>
-            <w:color w:val="434343"/>
-            <w:sz w:val="21"/>
-            <w:szCs w:val="21"/>
-            <w:u w:val="single"/>
-          </w:rPr>
-          <w:t xml:space="preserve"> </w:t>
-        </w:r>
-        <w:proofErr w:type="spellStart"/>
-        <w:r>
-          <w:rPr>
-            <w:i/>
-            <w:iCs/>
-            <w:color w:val="434343"/>
-            <w:sz w:val="21"/>
-            <w:szCs w:val="21"/>
-            <w:u w:val="single"/>
-          </w:rPr>
-          <w:t>Kehati</w:t>
-        </w:r>
-        <w:proofErr w:type="spellEnd"/>
       </w:hyperlink>
       <w:r>
         <w:rPr>
@@ -3884,12 +2830,8 @@
     </w:p>
     <w:p>
       <w:pPr>
-        <w:spacing w:before="300"/>
-      </w:pPr>
-    </w:p>
-    <w:p>
-      <w:pPr>
         <w:pStyle w:val="Heading3"/>
+        <w:spacing w:before="120"/>
       </w:pPr>
       <w:r>
         <w:t>International Conference Presentations</w:t>
@@ -3925,25 +2867,7 @@
           <w:sz w:val="21"/>
           <w:szCs w:val="21"/>
         </w:rPr>
-        <w:t xml:space="preserve">"The Success Strategy of Forest Community Program in </w:t>
-      </w:r>
-      <w:proofErr w:type="spellStart"/>
-      <w:r>
-        <w:rPr>
-          <w:color w:val="333333"/>
-          <w:sz w:val="21"/>
-          <w:szCs w:val="21"/>
-        </w:rPr>
-        <w:t>Pakpak</w:t>
-      </w:r>
-      <w:proofErr w:type="spellEnd"/>
-      <w:r>
-        <w:rPr>
-          <w:color w:val="333333"/>
-          <w:sz w:val="21"/>
-          <w:szCs w:val="21"/>
-        </w:rPr>
-        <w:t xml:space="preserve"> Bharat" – </w:t>
+        <w:t xml:space="preserve">"The Success Strategy of Forest Community Program in Pakpak Bharat" – </w:t>
       </w:r>
       <w:r>
         <w:rPr>
@@ -3986,43 +2910,7 @@
           <w:sz w:val="21"/>
           <w:szCs w:val="21"/>
         </w:rPr>
-        <w:t xml:space="preserve">"Study and Challenges of Orangutan Habitat in </w:t>
-      </w:r>
-      <w:proofErr w:type="spellStart"/>
-      <w:r>
-        <w:rPr>
-          <w:color w:val="333333"/>
-          <w:sz w:val="21"/>
-          <w:szCs w:val="21"/>
-        </w:rPr>
-        <w:t>Muara</w:t>
-      </w:r>
-      <w:proofErr w:type="spellEnd"/>
-      <w:r>
-        <w:rPr>
-          <w:color w:val="333333"/>
-          <w:sz w:val="21"/>
-          <w:szCs w:val="21"/>
-        </w:rPr>
-        <w:t xml:space="preserve"> </w:t>
-      </w:r>
-      <w:proofErr w:type="spellStart"/>
-      <w:r>
-        <w:rPr>
-          <w:color w:val="333333"/>
-          <w:sz w:val="21"/>
-          <w:szCs w:val="21"/>
-        </w:rPr>
-        <w:t>Kendawangan</w:t>
-      </w:r>
-      <w:proofErr w:type="spellEnd"/>
-      <w:r>
-        <w:rPr>
-          <w:color w:val="333333"/>
-          <w:sz w:val="21"/>
-          <w:szCs w:val="21"/>
-        </w:rPr>
-        <w:t xml:space="preserve">" – </w:t>
+        <w:t xml:space="preserve">"Study and Challenges of Orangutan Habitat in Muara Kendawangan" – </w:t>
       </w:r>
       <w:r>
         <w:rPr>
@@ -4048,6 +2936,8 @@
           <w:right w:val="nil"/>
           <w:between w:val="nil"/>
         </w:pBdr>
+        <w:spacing w:after="200"/>
+        <w:ind w:left="548" w:hanging="274"/>
       </w:pPr>
       <w:r>
         <w:rPr>
@@ -4065,25 +2955,7 @@
           <w:sz w:val="21"/>
           <w:szCs w:val="21"/>
         </w:rPr>
-        <w:t xml:space="preserve">"Preliminary Study on Sea Turtle in </w:t>
-      </w:r>
-      <w:proofErr w:type="spellStart"/>
-      <w:r>
-        <w:rPr>
-          <w:color w:val="333333"/>
-          <w:sz w:val="21"/>
-          <w:szCs w:val="21"/>
-        </w:rPr>
-        <w:t>Karimata</w:t>
-      </w:r>
-      <w:proofErr w:type="spellEnd"/>
-      <w:r>
-        <w:rPr>
-          <w:color w:val="333333"/>
-          <w:sz w:val="21"/>
-          <w:szCs w:val="21"/>
-        </w:rPr>
-        <w:t xml:space="preserve"> Islands" &amp; "Citizen Science in </w:t>
+        <w:t xml:space="preserve">"Preliminary Study on Sea Turtle in Karimata Islands" &amp; "Citizen Science in </w:t>
       </w:r>
       <w:proofErr w:type="spellStart"/>
       <w:r>
@@ -4113,11 +2985,6 @@
         </w:rPr>
         <w:t>APCRS 2023</w:t>
       </w:r>
-    </w:p>
-    <w:p>
-      <w:pPr>
-        <w:spacing w:before="400"/>
-      </w:pPr>
     </w:p>
     <w:tbl>
       <w:tblPr>
@@ -4575,25 +3442,7 @@
                 <w:sz w:val="19"/>
                 <w:szCs w:val="19"/>
               </w:rPr>
-              <w:t xml:space="preserve">University of </w:t>
-            </w:r>
-            <w:proofErr w:type="spellStart"/>
-            <w:r>
-              <w:rPr>
-                <w:color w:val="666666"/>
-                <w:sz w:val="19"/>
-                <w:szCs w:val="19"/>
-              </w:rPr>
-              <w:t>Tanjung</w:t>
-            </w:r>
-            <w:proofErr w:type="spellEnd"/>
-            <w:r>
-              <w:rPr>
-                <w:color w:val="666666"/>
-                <w:sz w:val="19"/>
-                <w:szCs w:val="19"/>
-              </w:rPr>
-              <w:t xml:space="preserve"> Pura</w:t>
+              <w:t>University of Tanjung Pura</w:t>
             </w:r>
           </w:p>
         </w:tc>
@@ -4658,25 +3507,7 @@
                 <w:sz w:val="19"/>
                 <w:szCs w:val="19"/>
               </w:rPr>
-              <w:t xml:space="preserve">University of </w:t>
-            </w:r>
-            <w:proofErr w:type="spellStart"/>
-            <w:r>
-              <w:rPr>
-                <w:color w:val="666666"/>
-                <w:sz w:val="19"/>
-                <w:szCs w:val="19"/>
-              </w:rPr>
-              <w:t>Nastional</w:t>
-            </w:r>
-            <w:proofErr w:type="spellEnd"/>
-            <w:r>
-              <w:rPr>
-                <w:color w:val="666666"/>
-                <w:sz w:val="19"/>
-                <w:szCs w:val="19"/>
-              </w:rPr>
-              <w:t xml:space="preserve"> (UNAS)</w:t>
+              <w:t>University of Nastional (UNAS)</w:t>
             </w:r>
           </w:p>
         </w:tc>
@@ -4714,7 +3545,7 @@
           </w:tcPr>
           <w:p>
             <w:pPr>
-              <w:spacing w:before="300" w:after="200"/>
+              <w:spacing w:before="120"/>
               <w:jc w:val="center"/>
             </w:pPr>
             <w:r>
@@ -4726,6 +3557,8 @@
               </w:rPr>
               <w:t>"Conservation is not just about saving species – it's about building sustainable relationships between people and nature."</w:t>
             </w:r>
+            <w:bookmarkStart w:id="0" w:name="_GoBack"/>
+            <w:bookmarkEnd w:id="0"/>
           </w:p>
         </w:tc>
       </w:tr>
@@ -6330,6 +5163,18 @@
       <w:szCs w:val="18"/>
     </w:rPr>
   </w:style>
+  <w:style w:type="character" w:styleId="UnresolvedMention">
+    <w:name w:val="Unresolved Mention"/>
+    <w:basedOn w:val="DefaultParagraphFont"/>
+    <w:uiPriority w:val="99"/>
+    <w:semiHidden/>
+    <w:unhideWhenUsed/>
+    <w:rsid w:val="00077287"/>
+    <w:rPr>
+      <w:color w:val="605E5C"/>
+      <w:shd w:val="clear" w:color="auto" w:fill="E1DFDD"/>
+    </w:rPr>
+  </w:style>
 </w:styles>
 </file>
 

</xml_diff>